<commit_message>
Fix NFC byte order and document verified GIGN account checks
</commit_message>
<xml_diff>
--- a/reporte/Reporte_Practica4_GIGN.docx
+++ b/reporte/Reporte_Practica4_GIGN.docx
@@ -212,7 +212,7 @@
     </w:p>
     <w:p>
       <w:r>
-        <w:t>El número se envía en orden big endian, del byte de mayor peso al de menor peso. Al final se agregan los bytes 90 00. Estos indican que el comando se respondió correctamente. El lector consulta al servidor para decidir si permite el acceso.</w:t>
+        <w:t>En este proyecto, el número se envía en orden little endian: primero el byte de menor peso. Ese orden coincide con la copia a uint32_t que hace ScannerHTTP en el ESP32. Al final se agregan 90 00, que indican que el comando se respondió correctamente. El lector consulta al servidor para decidir el acceso.</w:t>
       </w:r>
     </w:p>
     <w:p>
@@ -780,6 +780,17 @@
       </w:r>
     </w:p>
     <w:p>
+      <w:pPr>
+        <w:spacing w:after="100"/>
+      </w:pPr>
+      <w:r>
+        <w:rPr>
+          <w:sz w:val="16"/>
+        </w:rPr>
+        <w:t>Repositorio del equipo: código, APK e informe. https://github.com/aristocratte/NFC</w:t>
+      </w:r>
+    </w:p>
+    <w:p>
       <w:r>
         <w:br w:type="page"/>
       </w:r>
@@ -794,7 +805,7 @@
     </w:p>
     <w:p>
       <w:r>
-        <w:t>Estas capturas se hicieron en el navegador. Para ver la credencial se cargaron los datos públicos de Aristide en una sesión preparada. Esto permitió revisar el diseño, pero no fue una prueba de login con su contraseña.</w:t>
+        <w:t>Estas capturas se hicieron en el navegador. La API rechazó una cuenta ficticia que no existe. Después, se preparó una sesión con los datos públicos de Aristide para revisar la credencial. No se usó su contraseña.</w:t>
       </w:r>
     </w:p>
     <w:tbl>
@@ -824,11 +835,11 @@
                     <a:graphicData uri="http://schemas.openxmlformats.org/drawingml/2006/picture">
                       <pic:pic>
                         <pic:nvPicPr>
-                          <pic:cNvPr id="0" name="image.png"/>
+                          <pic:cNvPr id="0" name="login.png"/>
                           <pic:cNvPicPr/>
                         </pic:nvPicPr>
                         <pic:blipFill>
-                          <a:blip r:embed="rId23"/>
+                          <a:blip r:embed="rId26"/>
                           <a:stretch>
                             <a:fillRect/>
                           </a:stretch>
@@ -865,11 +876,11 @@
                     <a:graphicData uri="http://schemas.openxmlformats.org/drawingml/2006/picture">
                       <pic:pic>
                         <pic:nvPicPr>
-                          <pic:cNvPr id="0" name="image.png"/>
+                          <pic:cNvPr id="0" name="credential-full.png"/>
                           <pic:cNvPicPr/>
                         </pic:nvPicPr>
                         <pic:blipFill>
-                          <a:blip r:embed="rId24"/>
+                          <a:blip r:embed="rId27"/>
                           <a:stretch>
                             <a:fillRect/>
                           </a:stretch>
@@ -893,7 +904,7 @@
     </w:tbl>
     <w:p>
       <w:r>
-        <w:t>Figuras 3 y 4. Formulario de acceso y credencial con foto, nombre completo y número de usuario.</w:t>
+        <w:t>Figuras 3 y 4. Formulario tras un rechazo real de la API y credencial preparada con una respuesta simulada de login.</w:t>
       </w:r>
     </w:p>
     <w:p>
@@ -911,27 +922,157 @@
         <w:pStyle w:val="Titre1"/>
       </w:pPr>
       <w:r>
-        <w:t>NFC y prueba con el lector</w:t>
-      </w:r>
-    </w:p>
-    <w:p>
-      <w:r>
-        <w:t>El servicio NFC está en modules/acceso-nfc y tiene dos clases Kotlin. Una recibe el ID desde JavaScript. La otra responde al lector. Al cerrar sesión se borra el ID y se desactiva la respuesta. Si el proceso de la app se reinicia, hay que iniciar sesión otra vez.</w:t>
-      </w:r>
-    </w:p>
-    <w:p>
-      <w:r>
-        <w:t>El ID debe estar entre 1 y 4294967295 para caber en cuatro bytes. Por ejemplo, 767108734 se envía como 2D B9 26 7E. La respuesta completa es 2D B9 26 7E 90 00. Este ejemplo explica la conversión del código, no una lectura física.</w:t>
-      </w:r>
-    </w:p>
-    <w:p>
-      <w:r>
-        <w:t>Cuando llega un comando válido, el teléfono vibra y muestra "Lector detectado". El teléfono debe estar desbloqueado. La app no consulta el endpoint del escáner ni muestra si se permitió o se negó el acceso.</w:t>
-      </w:r>
-    </w:p>
-    <w:p>
-      <w:r>
-        <w:t>Se generó Voz-Estrategia.apk para instalar la app en un teléfono Android con NFC.</w:t>
+        <w:t>Pruebas con los tres usuarios</w:t>
+      </w:r>
+    </w:p>
+    <w:p>
+      <w:r>
+        <w:t>Se consultó el perfil público de cada integrante en MonsterBallGo y se descargó su imagen por HTTPS. Las seis peticiones respondieron HTTP 200. Los nombres, números e imágenes coinciden con el registro de la tarea de fotos de perfil.</w:t>
+      </w:r>
+    </w:p>
+    <w:tbl>
+      <w:tblPr>
+        <w:tblW w:type="auto" w:w="0"/>
+        <w:tblLook w:firstColumn="1" w:firstRow="1" w:lastColumn="0" w:lastRow="0" w:noHBand="0" w:noVBand="1" w:val="04A0"/>
+      </w:tblPr>
+      <w:tblGrid>
+        <w:gridCol w:w="3200"/>
+        <w:gridCol w:w="3200"/>
+        <w:gridCol w:w="3200"/>
+      </w:tblGrid>
+      <w:tr>
+        <w:tc>
+          <w:tcPr>
+            <w:tcW w:type="dxa" w:w="3200"/>
+          </w:tcPr>
+          <w:p>
+            <w:r>
+              <w:drawing>
+                <wp:inline xmlns:a="http://schemas.openxmlformats.org/drawingml/2006/main" xmlns:pic="http://schemas.openxmlformats.org/drawingml/2006/picture">
+                  <wp:extent cx="1828800" cy="2357120"/>
+                  <wp:docPr id="6" name="Picture 6"/>
+                  <wp:cNvGraphicFramePr>
+                    <a:graphicFrameLocks noChangeAspect="1"/>
+                  </wp:cNvGraphicFramePr>
+                  <a:graphic>
+                    <a:graphicData uri="http://schemas.openxmlformats.org/drawingml/2006/picture">
+                      <pic:pic>
+                        <pic:nvPicPr>
+                          <pic:cNvPr id="0" name="profile-aristidecordonnier.png"/>
+                          <pic:cNvPicPr/>
+                        </pic:nvPicPr>
+                        <pic:blipFill>
+                          <a:blip r:embed="rId28"/>
+                          <a:stretch>
+                            <a:fillRect/>
+                          </a:stretch>
+                        </pic:blipFill>
+                        <pic:spPr>
+                          <a:xfrm>
+                            <a:off x="0" y="0"/>
+                            <a:ext cx="1828800" cy="2357120"/>
+                          </a:xfrm>
+                          <a:prstGeom prst="rect"/>
+                        </pic:spPr>
+                      </pic:pic>
+                    </a:graphicData>
+                  </a:graphic>
+                </wp:inline>
+              </w:drawing>
+            </w:r>
+          </w:p>
+        </w:tc>
+        <w:tc>
+          <w:tcPr>
+            <w:tcW w:type="dxa" w:w="3200"/>
+          </w:tcPr>
+          <w:p>
+            <w:r>
+              <w:drawing>
+                <wp:inline xmlns:a="http://schemas.openxmlformats.org/drawingml/2006/main" xmlns:pic="http://schemas.openxmlformats.org/drawingml/2006/picture">
+                  <wp:extent cx="1828800" cy="2357120"/>
+                  <wp:docPr id="7" name="Picture 7"/>
+                  <wp:cNvGraphicFramePr>
+                    <a:graphicFrameLocks noChangeAspect="1"/>
+                  </wp:cNvGraphicFramePr>
+                  <a:graphic>
+                    <a:graphicData uri="http://schemas.openxmlformats.org/drawingml/2006/picture">
+                      <pic:pic>
+                        <pic:nvPicPr>
+                          <pic:cNvPr id="0" name="profile-mathisgil.png"/>
+                          <pic:cNvPicPr/>
+                        </pic:nvPicPr>
+                        <pic:blipFill>
+                          <a:blip r:embed="rId29"/>
+                          <a:stretch>
+                            <a:fillRect/>
+                          </a:stretch>
+                        </pic:blipFill>
+                        <pic:spPr>
+                          <a:xfrm>
+                            <a:off x="0" y="0"/>
+                            <a:ext cx="1828800" cy="2357120"/>
+                          </a:xfrm>
+                          <a:prstGeom prst="rect"/>
+                        </pic:spPr>
+                      </pic:pic>
+                    </a:graphicData>
+                  </a:graphic>
+                </wp:inline>
+              </w:drawing>
+            </w:r>
+          </w:p>
+        </w:tc>
+        <w:tc>
+          <w:tcPr>
+            <w:tcW w:type="dxa" w:w="3200"/>
+          </w:tcPr>
+          <w:p>
+            <w:r>
+              <w:drawing>
+                <wp:inline xmlns:a="http://schemas.openxmlformats.org/drawingml/2006/main" xmlns:pic="http://schemas.openxmlformats.org/drawingml/2006/picture">
+                  <wp:extent cx="1828800" cy="2357120"/>
+                  <wp:docPr id="8" name="Picture 8"/>
+                  <wp:cNvGraphicFramePr>
+                    <a:graphicFrameLocks noChangeAspect="1"/>
+                  </wp:cNvGraphicFramePr>
+                  <a:graphic>
+                    <a:graphicData uri="http://schemas.openxmlformats.org/drawingml/2006/picture">
+                      <pic:pic>
+                        <pic:nvPicPr>
+                          <pic:cNvPr id="0" name="profile-oscarbuat.png"/>
+                          <pic:cNvPicPr/>
+                        </pic:nvPicPr>
+                        <pic:blipFill>
+                          <a:blip r:embed="rId30"/>
+                          <a:stretch>
+                            <a:fillRect/>
+                          </a:stretch>
+                        </pic:blipFill>
+                        <pic:spPr>
+                          <a:xfrm>
+                            <a:off x="0" y="0"/>
+                            <a:ext cx="1828800" cy="2357120"/>
+                          </a:xfrm>
+                          <a:prstGeom prst="rect"/>
+                        </pic:spPr>
+                      </pic:pic>
+                    </a:graphicData>
+                  </a:graphic>
+                </wp:inline>
+              </w:drawing>
+            </w:r>
+          </w:p>
+        </w:tc>
+      </w:tr>
+    </w:tbl>
+    <w:p>
+      <w:r>
+        <w:rPr>
+          <w:i/>
+          <w:sz w:val="18"/>
+        </w:rPr>
+        <w:t>Figura 5. Perfiles públicos reales de Aristide, Mathis y Oscar. Se recortaron los datos de contacto.</w:t>
       </w:r>
     </w:p>
     <w:p>
@@ -939,12 +1080,180 @@
         <w:pStyle w:val="Titre2"/>
       </w:pPr>
       <w:r>
-        <w:t>Fotos de perfil</w:t>
-      </w:r>
-    </w:p>
-    <w:p>
-      <w:r>
-        <w:t>Las fotos de Aristide, Mathis y Oscar se cambiaron en la tarea anterior. La consulta de sus perfiles públicos confirmó que conservaban las imágenes personalizadas.</w:t>
+        <w:t>Credenciales revisadas</w:t>
+      </w:r>
+    </w:p>
+    <w:p>
+      <w:r>
+        <w:t>Con esos datos se prepararon tres respuestas de login en el navegador. Para cada usuario se revisaron el nombre, el número, la carga de la foto y el cierre de sesión. Esta prueba comprueba las pantallas; no comprueba la contraseña ni el permiso de entrada de la cuenta.</w:t>
+      </w:r>
+    </w:p>
+    <w:tbl>
+      <w:tblPr>
+        <w:tblW w:type="auto" w:w="0"/>
+        <w:tblLook w:firstColumn="1" w:firstRow="1" w:lastColumn="0" w:lastRow="0" w:noHBand="0" w:noVBand="1" w:val="04A0"/>
+      </w:tblPr>
+      <w:tblGrid>
+        <w:gridCol w:w="3200"/>
+        <w:gridCol w:w="3200"/>
+        <w:gridCol w:w="3200"/>
+      </w:tblGrid>
+      <w:tr>
+        <w:tc>
+          <w:tcPr>
+            <w:tcW w:type="dxa" w:w="3200"/>
+          </w:tcPr>
+          <w:p>
+            <w:r>
+              <w:drawing>
+                <wp:inline xmlns:a="http://schemas.openxmlformats.org/drawingml/2006/main" xmlns:pic="http://schemas.openxmlformats.org/drawingml/2006/picture">
+                  <wp:extent cx="1828800" cy="1104680"/>
+                  <wp:docPr id="9" name="Picture 9"/>
+                  <wp:cNvGraphicFramePr>
+                    <a:graphicFrameLocks noChangeAspect="1"/>
+                  </wp:cNvGraphicFramePr>
+                  <a:graphic>
+                    <a:graphicData uri="http://schemas.openxmlformats.org/drawingml/2006/picture">
+                      <pic:pic>
+                        <pic:nvPicPr>
+                          <pic:cNvPr id="0" name="credential-aristidecordonnier.png"/>
+                          <pic:cNvPicPr/>
+                        </pic:nvPicPr>
+                        <pic:blipFill>
+                          <a:blip r:embed="rId31"/>
+                          <a:stretch>
+                            <a:fillRect/>
+                          </a:stretch>
+                        </pic:blipFill>
+                        <pic:spPr>
+                          <a:xfrm>
+                            <a:off x="0" y="0"/>
+                            <a:ext cx="1828800" cy="1104680"/>
+                          </a:xfrm>
+                          <a:prstGeom prst="rect"/>
+                        </pic:spPr>
+                      </pic:pic>
+                    </a:graphicData>
+                  </a:graphic>
+                </wp:inline>
+              </w:drawing>
+            </w:r>
+          </w:p>
+        </w:tc>
+        <w:tc>
+          <w:tcPr>
+            <w:tcW w:type="dxa" w:w="3200"/>
+          </w:tcPr>
+          <w:p>
+            <w:r>
+              <w:drawing>
+                <wp:inline xmlns:a="http://schemas.openxmlformats.org/drawingml/2006/main" xmlns:pic="http://schemas.openxmlformats.org/drawingml/2006/picture">
+                  <wp:extent cx="1828800" cy="1041253"/>
+                  <wp:docPr id="10" name="Picture 10"/>
+                  <wp:cNvGraphicFramePr>
+                    <a:graphicFrameLocks noChangeAspect="1"/>
+                  </wp:cNvGraphicFramePr>
+                  <a:graphic>
+                    <a:graphicData uri="http://schemas.openxmlformats.org/drawingml/2006/picture">
+                      <pic:pic>
+                        <pic:nvPicPr>
+                          <pic:cNvPr id="0" name="credential-mathisgil.png"/>
+                          <pic:cNvPicPr/>
+                        </pic:nvPicPr>
+                        <pic:blipFill>
+                          <a:blip r:embed="rId32"/>
+                          <a:stretch>
+                            <a:fillRect/>
+                          </a:stretch>
+                        </pic:blipFill>
+                        <pic:spPr>
+                          <a:xfrm>
+                            <a:off x="0" y="0"/>
+                            <a:ext cx="1828800" cy="1041253"/>
+                          </a:xfrm>
+                          <a:prstGeom prst="rect"/>
+                        </pic:spPr>
+                      </pic:pic>
+                    </a:graphicData>
+                  </a:graphic>
+                </wp:inline>
+              </w:drawing>
+            </w:r>
+          </w:p>
+        </w:tc>
+        <w:tc>
+          <w:tcPr>
+            <w:tcW w:type="dxa" w:w="3200"/>
+          </w:tcPr>
+          <w:p>
+            <w:r>
+              <w:drawing>
+                <wp:inline xmlns:a="http://schemas.openxmlformats.org/drawingml/2006/main" xmlns:pic="http://schemas.openxmlformats.org/drawingml/2006/picture">
+                  <wp:extent cx="1828800" cy="1041253"/>
+                  <wp:docPr id="11" name="Picture 11"/>
+                  <wp:cNvGraphicFramePr>
+                    <a:graphicFrameLocks noChangeAspect="1"/>
+                  </wp:cNvGraphicFramePr>
+                  <a:graphic>
+                    <a:graphicData uri="http://schemas.openxmlformats.org/drawingml/2006/picture">
+                      <pic:pic>
+                        <pic:nvPicPr>
+                          <pic:cNvPr id="0" name="credential-oscarbuat.png"/>
+                          <pic:cNvPicPr/>
+                        </pic:nvPicPr>
+                        <pic:blipFill>
+                          <a:blip r:embed="rId33"/>
+                          <a:stretch>
+                            <a:fillRect/>
+                          </a:stretch>
+                        </pic:blipFill>
+                        <pic:spPr>
+                          <a:xfrm>
+                            <a:off x="0" y="0"/>
+                            <a:ext cx="1828800" cy="1041253"/>
+                          </a:xfrm>
+                          <a:prstGeom prst="rect"/>
+                        </pic:spPr>
+                      </pic:pic>
+                    </a:graphicData>
+                  </a:graphic>
+                </wp:inline>
+              </w:drawing>
+            </w:r>
+          </w:p>
+        </w:tc>
+      </w:tr>
+    </w:tbl>
+    <w:p>
+      <w:r>
+        <w:rPr>
+          <w:i/>
+          <w:sz w:val="18"/>
+        </w:rPr>
+        <w:t>Figura 6. Las tres credenciales en la app con respuestas de login simuladas y fotos reales del perfil.</w:t>
+      </w:r>
+    </w:p>
+    <w:p>
+      <w:r>
+        <w:t>No hubo que cambiar otra vez las fotos. Las URLs de las tres imágenes siguen siendo las guardadas en el trabajo anterior. Consultar un perfil público confirma que existe y que su imagen carga; iniciar sesión requiere además la contraseña.</w:t>
+      </w:r>
+    </w:p>
+    <w:p>
+      <w:r>
+        <w:br w:type="page"/>
+      </w:r>
+    </w:p>
+    <w:p>
+      <w:pPr>
+        <w:pStyle w:val="Titre1"/>
+      </w:pPr>
+      <w:r>
+        <w:t>Pruebas del servicio NFC</w:t>
+      </w:r>
+    </w:p>
+    <w:p>
+      <w:r>
+        <w:t>El servicio está en modules/acceso-nfc y tiene dos clases Kotlin. Una recibe el ID desde JavaScript. La otra responde al lector. Al cerrar sesión se borra el ID y se desactiva la respuesta. Si el proceso de la app se reinicia, hay que iniciar sesión otra vez.</w:t>
       </w:r>
     </w:p>
     <w:p>
@@ -952,12 +1261,206 @@
         <w:pStyle w:val="Titre2"/>
       </w:pPr>
       <w:r>
-        <w:t>Demostración en clase</w:t>
-      </w:r>
-    </w:p>
-    <w:p>
-      <w:r>
-        <w:t>Instalar el APK, activar NFC e iniciar sesión. Acercar el teléfono desbloqueado al PN532. Revisar la vibración o el mensaje en la app y mirar el resultado en el panel y en los LED. Cerrar sesión y repetir con cada integrante. El profesor debe bloquear una de las cuentas antes de la prueba.</w:t>
+        <w:t>Orden de los cuatro bytes</w:t>
+      </w:r>
+    </w:p>
+    <w:p>
+      <w:r>
+        <w:t>Al comparar la app con ScannerHTTP se encontró que el envío inicial estaba en big endian. El firmware copia esos bytes directamente a un uint32_t del ESP32, que usa little endian. Se corrigió el orden en la app y se volvió a compilar el APK. El firmware del profesor se conservó.</w:t>
+      </w:r>
+    </w:p>
+    <w:tbl>
+      <w:tblPr>
+        <w:tblStyle w:val="Grilledutableau"/>
+        <w:tblW w:type="auto" w:w="0"/>
+        <w:tblLook w:firstColumn="1" w:firstRow="1" w:lastColumn="0" w:lastRow="0" w:noHBand="0" w:noVBand="1" w:val="04A0"/>
+      </w:tblPr>
+      <w:tblGrid>
+        <w:gridCol w:w="3200"/>
+        <w:gridCol w:w="3200"/>
+        <w:gridCol w:w="3200"/>
+      </w:tblGrid>
+      <w:tr>
+        <w:tc>
+          <w:tcPr>
+            <w:tcW w:type="dxa" w:w="3200"/>
+          </w:tcPr>
+          <w:p>
+            <w:r>
+              <w:rPr>
+                <w:sz w:val="18"/>
+              </w:rPr>
+              <w:t>Usuario</w:t>
+            </w:r>
+          </w:p>
+        </w:tc>
+        <w:tc>
+          <w:tcPr>
+            <w:tcW w:type="dxa" w:w="3200"/>
+          </w:tcPr>
+          <w:p>
+            <w:r>
+              <w:rPr>
+                <w:sz w:val="18"/>
+              </w:rPr>
+              <w:t>ID</w:t>
+            </w:r>
+          </w:p>
+        </w:tc>
+        <w:tc>
+          <w:tcPr>
+            <w:tcW w:type="dxa" w:w="3200"/>
+          </w:tcPr>
+          <w:p>
+            <w:r>
+              <w:rPr>
+                <w:sz w:val="18"/>
+              </w:rPr>
+              <w:t>Respuesta completa</w:t>
+            </w:r>
+          </w:p>
+        </w:tc>
+      </w:tr>
+      <w:tr>
+        <w:tc>
+          <w:tcPr>
+            <w:tcW w:type="dxa" w:w="3200"/>
+          </w:tcPr>
+          <w:p>
+            <w:r>
+              <w:rPr>
+                <w:sz w:val="18"/>
+              </w:rPr>
+              <w:t>aristidecordonnier</w:t>
+            </w:r>
+          </w:p>
+        </w:tc>
+        <w:tc>
+          <w:tcPr>
+            <w:tcW w:type="dxa" w:w="3200"/>
+          </w:tcPr>
+          <w:p>
+            <w:r>
+              <w:rPr>
+                <w:sz w:val="18"/>
+              </w:rPr>
+              <w:t>767108734</w:t>
+            </w:r>
+          </w:p>
+        </w:tc>
+        <w:tc>
+          <w:tcPr>
+            <w:tcW w:type="dxa" w:w="3200"/>
+          </w:tcPr>
+          <w:p>
+            <w:r>
+              <w:rPr>
+                <w:sz w:val="18"/>
+              </w:rPr>
+              <w:t>7E 26 B9 2D 90 00</w:t>
+            </w:r>
+          </w:p>
+        </w:tc>
+      </w:tr>
+      <w:tr>
+        <w:tc>
+          <w:tcPr>
+            <w:tcW w:type="dxa" w:w="3200"/>
+          </w:tcPr>
+          <w:p>
+            <w:r>
+              <w:rPr>
+                <w:sz w:val="18"/>
+              </w:rPr>
+              <w:t>mathisgil</w:t>
+            </w:r>
+          </w:p>
+        </w:tc>
+        <w:tc>
+          <w:tcPr>
+            <w:tcW w:type="dxa" w:w="3200"/>
+          </w:tcPr>
+          <w:p>
+            <w:r>
+              <w:rPr>
+                <w:sz w:val="18"/>
+              </w:rPr>
+              <w:t>651791183</w:t>
+            </w:r>
+          </w:p>
+        </w:tc>
+        <w:tc>
+          <w:tcPr>
+            <w:tcW w:type="dxa" w:w="3200"/>
+          </w:tcPr>
+          <w:p>
+            <w:r>
+              <w:rPr>
+                <w:sz w:val="18"/>
+              </w:rPr>
+              <w:t>4F 8B D9 26 90 00</w:t>
+            </w:r>
+          </w:p>
+        </w:tc>
+      </w:tr>
+      <w:tr>
+        <w:tc>
+          <w:tcPr>
+            <w:tcW w:type="dxa" w:w="3200"/>
+          </w:tcPr>
+          <w:p>
+            <w:r>
+              <w:rPr>
+                <w:sz w:val="18"/>
+              </w:rPr>
+              <w:t>oscarbuat</w:t>
+            </w:r>
+          </w:p>
+        </w:tc>
+        <w:tc>
+          <w:tcPr>
+            <w:tcW w:type="dxa" w:w="3200"/>
+          </w:tcPr>
+          <w:p>
+            <w:r>
+              <w:rPr>
+                <w:sz w:val="18"/>
+              </w:rPr>
+              <w:t>877063652</w:t>
+            </w:r>
+          </w:p>
+        </w:tc>
+        <w:tc>
+          <w:tcPr>
+            <w:tcW w:type="dxa" w:w="3200"/>
+          </w:tcPr>
+          <w:p>
+            <w:r>
+              <w:rPr>
+                <w:sz w:val="18"/>
+              </w:rPr>
+              <w:t>E4 ED 46 34 90 00</w:t>
+            </w:r>
+          </w:p>
+        </w:tc>
+      </w:tr>
+    </w:tbl>
+    <w:p>
+      <w:r>
+        <w:t>Los primeros cuatro bytes contienen el número. Los dos últimos, 90 00, indican una respuesta APDU correcta. No significan que el usuario tenga acceso.</w:t>
+      </w:r>
+    </w:p>
+    <w:p>
+      <w:pPr>
+        <w:pStyle w:val="Titre2"/>
+      </w:pPr>
+      <w:r>
+        <w:t>Ejecución sin teléfono</w:t>
+      </w:r>
+    </w:p>
+    <w:p>
+      <w:r>
+        <w:t>Se ejecutó en la computadora la clase Kotlin compilada que responde al lector. Se sustituyeron las funciones de Android, como la vibración y el almacenamiento. Pasaron 20 comprobaciones: los tres IDs, los límites 1 y 4294967295, SELECT con o sin el byte final 00, comandos inválidos y ausencia de sesión.</w:t>
       </w:r>
     </w:p>
     <w:tbl>
@@ -993,7 +1496,7 @@
               <w:rPr>
                 <w:sz w:val="18"/>
               </w:rPr>
-              <w:t>Comportamiento esperado</w:t>
+              <w:t>Respuesta comprobada</w:t>
             </w:r>
           </w:p>
         </w:tc>
@@ -1008,7 +1511,7 @@
               <w:rPr>
                 <w:sz w:val="18"/>
               </w:rPr>
-              <w:t>Cuenta habilitada</w:t>
+              <w:t>SELECT correcto con sesión</w:t>
             </w:r>
           </w:p>
         </w:tc>
@@ -1021,7 +1524,7 @@
               <w:rPr>
                 <w:sz w:val="18"/>
               </w:rPr>
-              <w:t>La app entrega el ID. El lector consulta al servidor y permite el acceso si la cuenta está autorizada.</w:t>
+              <w:t>Cuatro bytes del ID y 90 00</w:t>
             </w:r>
           </w:p>
         </w:tc>
@@ -1036,7 +1539,7 @@
               <w:rPr>
                 <w:sz w:val="18"/>
               </w:rPr>
-              <w:t>Cuenta bloqueada</w:t>
+              <w:t>Sesión cerrada o ID ausente</w:t>
             </w:r>
           </w:p>
         </w:tc>
@@ -1049,7 +1552,7 @@
               <w:rPr>
                 <w:sz w:val="18"/>
               </w:rPr>
-              <w:t>La app entrega el ID de la misma forma. El lector consulta al servidor y niega el acceso.</w:t>
+              <w:t>69 85; no entrega el ID</w:t>
             </w:r>
           </w:p>
         </w:tc>
@@ -1064,7 +1567,7 @@
               <w:rPr>
                 <w:sz w:val="18"/>
               </w:rPr>
-              <w:t>Sesión cerrada</w:t>
+              <w:t>AID o longitud incorrectos</w:t>
             </w:r>
           </w:p>
         </w:tc>
@@ -1077,7 +1580,35 @@
               <w:rPr>
                 <w:sz w:val="18"/>
               </w:rPr>
-              <w:t>El servicio deja de entregar el número de usuario.</w:t>
+              <w:t>6A 82; no dispara la detección</w:t>
+            </w:r>
+          </w:p>
+        </w:tc>
+      </w:tr>
+      <w:tr>
+        <w:tc>
+          <w:tcPr>
+            <w:tcW w:type="dxa" w:w="4800"/>
+          </w:tcPr>
+          <w:p>
+            <w:r>
+              <w:rPr>
+                <w:sz w:val="18"/>
+              </w:rPr>
+              <w:t>Comando nulo</w:t>
+            </w:r>
+          </w:p>
+        </w:tc>
+        <w:tc>
+          <w:tcPr>
+            <w:tcW w:type="dxa" w:w="4800"/>
+          </w:tcPr>
+          <w:p>
+            <w:r>
+              <w:rPr>
+                <w:sz w:val="18"/>
+              </w:rPr>
+              <w:t>6F 00</w:t>
             </w:r>
           </w:p>
         </w:tc>
@@ -1085,7 +1616,20 @@
     </w:tbl>
     <w:p>
       <w:r>
-        <w:t>Para documentar la demostración se necesita una captura del panel web y una foto del Arduino con el LED encendido. Ambas deben corresponder al mismo intento e identificar la cuenta usada. Así se puede comparar lo que recibió el servidor con la señal del montaje.</w:t>
+        <w:t>Estos resultados verifican el cálculo y las respuestas del código. No miden la comunicación por radio, la vibración física ni el funcionamiento de HCE en un teléfono. La app sigue sin llamar al endpoint del escáner y sin mostrar una decisión de acceso.</w:t>
+      </w:r>
+    </w:p>
+    <w:p>
+      <w:pPr>
+        <w:pStyle w:val="Titre2"/>
+      </w:pPr>
+      <w:r>
+        <w:t>Prueba con el montaje</w:t>
+      </w:r>
+    </w:p>
+    <w:p>
+      <w:r>
+        <w:t>Instalar el APK, activar NFC e iniciar sesión. Acercar el teléfono desbloqueado al PN532, revisar la detección en la app y comparar el ID del panel con la credencial. Repetir con cada integrante, incluido el que bloquee el profesor, y fotografiar el LED del mismo intento.</w:t>
       </w:r>
     </w:p>
     <w:p>
@@ -1098,15 +1642,364 @@
         <w:pStyle w:val="Titre1"/>
       </w:pPr>
       <w:r>
+        <w:t>Pruebas reales del servidor y del panel</w:t>
+      </w:r>
+    </w:p>
+    <w:p>
+      <w:r>
+        <w:t>Desde la computadora se consultó el endpoint HTTPS del escáner con los tres IDs del equipo. Cada consulta respondió HTTP 200 y si. El panel real recibió los datos por WebSocket, mostró el nombre y el número correctos y pintó la tarjeta en verde. No se usó NFC para producir estos eventos ni se cambió el estado de las cuentas.</w:t>
+      </w:r>
+    </w:p>
+    <w:tbl>
+      <w:tblPr>
+        <w:tblStyle w:val="Grilledutableau"/>
+        <w:tblW w:type="auto" w:w="0"/>
+        <w:tblLook w:firstColumn="1" w:firstRow="1" w:lastColumn="0" w:lastRow="0" w:noHBand="0" w:noVBand="1" w:val="04A0"/>
+      </w:tblPr>
+      <w:tblGrid>
+        <w:gridCol w:w="3200"/>
+        <w:gridCol w:w="3200"/>
+        <w:gridCol w:w="3200"/>
+      </w:tblGrid>
+      <w:tr>
+        <w:tc>
+          <w:tcPr>
+            <w:tcW w:type="dxa" w:w="3200"/>
+          </w:tcPr>
+          <w:p>
+            <w:r>
+              <w:rPr>
+                <w:sz w:val="18"/>
+              </w:rPr>
+              <w:t>Usuario</w:t>
+            </w:r>
+          </w:p>
+        </w:tc>
+        <w:tc>
+          <w:tcPr>
+            <w:tcW w:type="dxa" w:w="3200"/>
+          </w:tcPr>
+          <w:p>
+            <w:r>
+              <w:rPr>
+                <w:sz w:val="18"/>
+              </w:rPr>
+              <w:t>Respuesta API</w:t>
+            </w:r>
+          </w:p>
+        </w:tc>
+        <w:tc>
+          <w:tcPr>
+            <w:tcW w:type="dxa" w:w="3200"/>
+          </w:tcPr>
+          <w:p>
+            <w:r>
+              <w:rPr>
+                <w:sz w:val="18"/>
+              </w:rPr>
+              <w:t>Panel real</w:t>
+            </w:r>
+          </w:p>
+        </w:tc>
+      </w:tr>
+      <w:tr>
+        <w:tc>
+          <w:tcPr>
+            <w:tcW w:type="dxa" w:w="3200"/>
+          </w:tcPr>
+          <w:p>
+            <w:r>
+              <w:rPr>
+                <w:sz w:val="18"/>
+              </w:rPr>
+              <w:t>aristidecordonnier</w:t>
+            </w:r>
+          </w:p>
+        </w:tc>
+        <w:tc>
+          <w:tcPr>
+            <w:tcW w:type="dxa" w:w="3200"/>
+          </w:tcPr>
+          <w:p>
+            <w:r>
+              <w:rPr>
+                <w:sz w:val="18"/>
+              </w:rPr>
+              <w:t>HTTP 200 · si</w:t>
+            </w:r>
+          </w:p>
+        </w:tc>
+        <w:tc>
+          <w:tcPr>
+            <w:tcW w:type="dxa" w:w="3200"/>
+          </w:tcPr>
+          <w:p>
+            <w:r>
+              <w:rPr>
+                <w:sz w:val="18"/>
+              </w:rPr>
+              <w:t>Nombre e ID correctos; verde</w:t>
+            </w:r>
+          </w:p>
+        </w:tc>
+      </w:tr>
+      <w:tr>
+        <w:tc>
+          <w:tcPr>
+            <w:tcW w:type="dxa" w:w="3200"/>
+          </w:tcPr>
+          <w:p>
+            <w:r>
+              <w:rPr>
+                <w:sz w:val="18"/>
+              </w:rPr>
+              <w:t>mathisgil</w:t>
+            </w:r>
+          </w:p>
+        </w:tc>
+        <w:tc>
+          <w:tcPr>
+            <w:tcW w:type="dxa" w:w="3200"/>
+          </w:tcPr>
+          <w:p>
+            <w:r>
+              <w:rPr>
+                <w:sz w:val="18"/>
+              </w:rPr>
+              <w:t>HTTP 200 · si</w:t>
+            </w:r>
+          </w:p>
+        </w:tc>
+        <w:tc>
+          <w:tcPr>
+            <w:tcW w:type="dxa" w:w="3200"/>
+          </w:tcPr>
+          <w:p>
+            <w:r>
+              <w:rPr>
+                <w:sz w:val="18"/>
+              </w:rPr>
+              <w:t>Nombre e ID correctos; verde</w:t>
+            </w:r>
+          </w:p>
+        </w:tc>
+      </w:tr>
+      <w:tr>
+        <w:tc>
+          <w:tcPr>
+            <w:tcW w:type="dxa" w:w="3200"/>
+          </w:tcPr>
+          <w:p>
+            <w:r>
+              <w:rPr>
+                <w:sz w:val="18"/>
+              </w:rPr>
+              <w:t>oscarbuat</w:t>
+            </w:r>
+          </w:p>
+        </w:tc>
+        <w:tc>
+          <w:tcPr>
+            <w:tcW w:type="dxa" w:w="3200"/>
+          </w:tcPr>
+          <w:p>
+            <w:r>
+              <w:rPr>
+                <w:sz w:val="18"/>
+              </w:rPr>
+              <w:t>HTTP 200 · si</w:t>
+            </w:r>
+          </w:p>
+        </w:tc>
+        <w:tc>
+          <w:tcPr>
+            <w:tcW w:type="dxa" w:w="3200"/>
+          </w:tcPr>
+          <w:p>
+            <w:r>
+              <w:rPr>
+                <w:sz w:val="18"/>
+              </w:rPr>
+              <w:t>Nombre e ID correctos; verde</w:t>
+            </w:r>
+          </w:p>
+        </w:tc>
+      </w:tr>
+    </w:tbl>
+    <w:tbl>
+      <w:tblPr>
+        <w:tblW w:type="auto" w:w="0"/>
+        <w:tblLook w:firstColumn="1" w:firstRow="1" w:lastColumn="0" w:lastRow="0" w:noHBand="0" w:noVBand="1" w:val="04A0"/>
+      </w:tblPr>
+      <w:tblGrid>
+        <w:gridCol w:w="3200"/>
+        <w:gridCol w:w="3200"/>
+        <w:gridCol w:w="3200"/>
+      </w:tblGrid>
+      <w:tr>
+        <w:tc>
+          <w:tcPr>
+            <w:tcW w:type="dxa" w:w="3200"/>
+          </w:tcPr>
+          <w:p>
+            <w:r>
+              <w:drawing>
+                <wp:inline xmlns:a="http://schemas.openxmlformats.org/drawingml/2006/main" xmlns:pic="http://schemas.openxmlformats.org/drawingml/2006/picture">
+                  <wp:extent cx="1828800" cy="2400300"/>
+                  <wp:docPr id="12" name="Picture 12"/>
+                  <wp:cNvGraphicFramePr>
+                    <a:graphicFrameLocks noChangeAspect="1"/>
+                  </wp:cNvGraphicFramePr>
+                  <a:graphic>
+                    <a:graphicData uri="http://schemas.openxmlformats.org/drawingml/2006/picture">
+                      <pic:pic>
+                        <pic:nvPicPr>
+                          <pic:cNvPr id="0" name="panel-live-aristidecordonnier.png"/>
+                          <pic:cNvPicPr/>
+                        </pic:nvPicPr>
+                        <pic:blipFill>
+                          <a:blip r:embed="rId34"/>
+                          <a:stretch>
+                            <a:fillRect/>
+                          </a:stretch>
+                        </pic:blipFill>
+                        <pic:spPr>
+                          <a:xfrm>
+                            <a:off x="0" y="0"/>
+                            <a:ext cx="1828800" cy="2400300"/>
+                          </a:xfrm>
+                          <a:prstGeom prst="rect"/>
+                        </pic:spPr>
+                      </pic:pic>
+                    </a:graphicData>
+                  </a:graphic>
+                </wp:inline>
+              </w:drawing>
+            </w:r>
+          </w:p>
+        </w:tc>
+        <w:tc>
+          <w:tcPr>
+            <w:tcW w:type="dxa" w:w="3200"/>
+          </w:tcPr>
+          <w:p>
+            <w:r>
+              <w:drawing>
+                <wp:inline xmlns:a="http://schemas.openxmlformats.org/drawingml/2006/main" xmlns:pic="http://schemas.openxmlformats.org/drawingml/2006/picture">
+                  <wp:extent cx="1828800" cy="2400300"/>
+                  <wp:docPr id="13" name="Picture 13"/>
+                  <wp:cNvGraphicFramePr>
+                    <a:graphicFrameLocks noChangeAspect="1"/>
+                  </wp:cNvGraphicFramePr>
+                  <a:graphic>
+                    <a:graphicData uri="http://schemas.openxmlformats.org/drawingml/2006/picture">
+                      <pic:pic>
+                        <pic:nvPicPr>
+                          <pic:cNvPr id="0" name="panel-live-mathisgil.png"/>
+                          <pic:cNvPicPr/>
+                        </pic:nvPicPr>
+                        <pic:blipFill>
+                          <a:blip r:embed="rId35"/>
+                          <a:stretch>
+                            <a:fillRect/>
+                          </a:stretch>
+                        </pic:blipFill>
+                        <pic:spPr>
+                          <a:xfrm>
+                            <a:off x="0" y="0"/>
+                            <a:ext cx="1828800" cy="2400300"/>
+                          </a:xfrm>
+                          <a:prstGeom prst="rect"/>
+                        </pic:spPr>
+                      </pic:pic>
+                    </a:graphicData>
+                  </a:graphic>
+                </wp:inline>
+              </w:drawing>
+            </w:r>
+          </w:p>
+        </w:tc>
+        <w:tc>
+          <w:tcPr>
+            <w:tcW w:type="dxa" w:w="3200"/>
+          </w:tcPr>
+          <w:p>
+            <w:r>
+              <w:drawing>
+                <wp:inline xmlns:a="http://schemas.openxmlformats.org/drawingml/2006/main" xmlns:pic="http://schemas.openxmlformats.org/drawingml/2006/picture">
+                  <wp:extent cx="1828800" cy="2400300"/>
+                  <wp:docPr id="14" name="Picture 14"/>
+                  <wp:cNvGraphicFramePr>
+                    <a:graphicFrameLocks noChangeAspect="1"/>
+                  </wp:cNvGraphicFramePr>
+                  <a:graphic>
+                    <a:graphicData uri="http://schemas.openxmlformats.org/drawingml/2006/picture">
+                      <pic:pic>
+                        <pic:nvPicPr>
+                          <pic:cNvPr id="0" name="panel-live-oscarbuat.png"/>
+                          <pic:cNvPicPr/>
+                        </pic:nvPicPr>
+                        <pic:blipFill>
+                          <a:blip r:embed="rId36"/>
+                          <a:stretch>
+                            <a:fillRect/>
+                          </a:stretch>
+                        </pic:blipFill>
+                        <pic:spPr>
+                          <a:xfrm>
+                            <a:off x="0" y="0"/>
+                            <a:ext cx="1828800" cy="2400300"/>
+                          </a:xfrm>
+                          <a:prstGeom prst="rect"/>
+                        </pic:spPr>
+                      </pic:pic>
+                    </a:graphicData>
+                  </a:graphic>
+                </wp:inline>
+              </w:drawing>
+            </w:r>
+          </w:p>
+        </w:tc>
+      </w:tr>
+    </w:tbl>
+    <w:p>
+      <w:r>
+        <w:rPr>
+          <w:i/>
+          <w:sz w:val="18"/>
+        </w:rPr>
+        <w:t>Figura 7. Panel real del profesor después de consultas directas a la API desde la computadora. No son escaneos NFC. Se recortaron los datos de contacto.</w:t>
+      </w:r>
+    </w:p>
+    <w:p>
+      <w:pPr>
+        <w:pStyle w:val="Titre2"/>
+      </w:pPr>
+      <w:r>
+        <w:t>Cuenta bloqueada y otros errores</w:t>
+      </w:r>
+    </w:p>
+    <w:p>
+      <w:r>
+        <w:t>Los tres IDs recibieron autorización en estas consultas. El caso bloqueado se probó por separado con datos simulados: el código scanner.js respondió si para active y no para banned con cada ID. También negó un ID desconocido, un token incorrecto y una petición sin ID. Pasaron nueve casos del servidor local y seis del HTML del panel con mensajes simulados.</w:t>
+      </w:r>
+    </w:p>
+    <w:p>
+      <w:r>
+        <w:t>Estas pruebas muestran que la base real reconoce los tres IDs y que el panel recibe los eventos. Para la demostración exigida falta que el teléfono entregue el ID por NFC y que el Arduino encienda el LED correspondiente. El profesor debe bloquear una cuenta para comprobar también ese rechazo en el montaje real.</w:t>
+      </w:r>
+    </w:p>
+    <w:p>
+      <w:r>
+        <w:br w:type="page"/>
+      </w:r>
+    </w:p>
+    <w:p>
+      <w:pPr>
+        <w:pStyle w:val="Titre1"/>
+      </w:pPr>
+      <w:r>
         <w:t>Análisis de resultados y mejoras</w:t>
-      </w:r>
-    </w:p>
-    <w:p>
-      <w:pPr>
-        <w:pStyle w:val="Titre2"/>
-      </w:pPr>
-      <w:r>
-        <w:t>Qué se revisó</w:t>
       </w:r>
     </w:p>
     <w:tbl>
@@ -1142,7 +2035,7 @@
               <w:rPr>
                 <w:sz w:val="18"/>
               </w:rPr>
-              <w:t>Resultado</w:t>
+              <w:t>Resultado observado</w:t>
             </w:r>
           </w:p>
         </w:tc>
@@ -1157,7 +2050,7 @@
               <w:rPr>
                 <w:sz w:val="18"/>
               </w:rPr>
-              <w:t>Pantallas en el navegador</w:t>
+              <w:t>Perfiles e imágenes de los tres usuarios</w:t>
             </w:r>
           </w:p>
         </w:tc>
@@ -1170,7 +2063,7 @@
               <w:rPr>
                 <w:sz w:val="18"/>
               </w:rPr>
-              <w:t>Formulario, errores simulados, navegación y cierre de sesión revisados</w:t>
+              <w:t>Seis respuestas HTTP 200; datos e imágenes coinciden</w:t>
             </w:r>
           </w:p>
         </w:tc>
@@ -1185,7 +2078,7 @@
               <w:rPr>
                 <w:sz w:val="18"/>
               </w:rPr>
-              <w:t>Compilación Android</w:t>
+              <w:t>Login con cuenta ficticia inexistente</w:t>
             </w:r>
           </w:p>
         </w:tc>
@@ -1198,7 +2091,7 @@
               <w:rPr>
                 <w:sz w:val="18"/>
               </w:rPr>
-              <w:t>APK creado para instalar la app</w:t>
+              <w:t>API real devuelve Failed to login; la app muestra el error</w:t>
             </w:r>
           </w:p>
         </w:tc>
@@ -1213,7 +2106,7 @@
               <w:rPr>
                 <w:sz w:val="18"/>
               </w:rPr>
-              <w:t>Login real y lectura NFC</w:t>
+              <w:t>API del escáner y panel reales</w:t>
             </w:r>
           </w:p>
         </w:tc>
@@ -1226,7 +2119,119 @@
               <w:rPr>
                 <w:sz w:val="18"/>
               </w:rPr>
-              <w:t>Sin resultados registrados con un dispositivo real</w:t>
+              <w:t>Los tres IDs reciben si; sus nombres e IDs aparecen en verde en el panel</w:t>
+            </w:r>
+          </w:p>
+        </w:tc>
+      </w:tr>
+      <w:tr>
+        <w:tc>
+          <w:tcPr>
+            <w:tcW w:type="dxa" w:w="4800"/>
+          </w:tcPr>
+          <w:p>
+            <w:r>
+              <w:rPr>
+                <w:sz w:val="18"/>
+              </w:rPr>
+              <w:t>Interfaz en navegador</w:t>
+            </w:r>
+          </w:p>
+        </w:tc>
+        <w:tc>
+          <w:tcPr>
+            <w:tcW w:type="dxa" w:w="4800"/>
+          </w:tcPr>
+          <w:p>
+            <w:r>
+              <w:rPr>
+                <w:sz w:val="18"/>
+              </w:rPr>
+              <w:t>20 comprobaciones correctas, incluidas las tres credenciales preparadas y la desconexión</w:t>
+            </w:r>
+          </w:p>
+        </w:tc>
+      </w:tr>
+      <w:tr>
+        <w:tc>
+          <w:tcPr>
+            <w:tcW w:type="dxa" w:w="4800"/>
+          </w:tcPr>
+          <w:p>
+            <w:r>
+              <w:rPr>
+                <w:sz w:val="18"/>
+              </w:rPr>
+              <w:t>Servicio APDU en computadora</w:t>
+            </w:r>
+          </w:p>
+        </w:tc>
+        <w:tc>
+          <w:tcPr>
+            <w:tcW w:type="dxa" w:w="4800"/>
+          </w:tcPr>
+          <w:p>
+            <w:r>
+              <w:rPr>
+                <w:sz w:val="18"/>
+              </w:rPr>
+              <w:t>20 comprobaciones correctas con funciones Android sustituidas</w:t>
+            </w:r>
+          </w:p>
+        </w:tc>
+      </w:tr>
+      <w:tr>
+        <w:tc>
+          <w:tcPr>
+            <w:tcW w:type="dxa" w:w="4800"/>
+          </w:tcPr>
+          <w:p>
+            <w:r>
+              <w:rPr>
+                <w:sz w:val="18"/>
+              </w:rPr>
+              <w:t>Servidor y panel con datos simulados</w:t>
+            </w:r>
+          </w:p>
+        </w:tc>
+        <w:tc>
+          <w:tcPr>
+            <w:tcW w:type="dxa" w:w="4800"/>
+          </w:tcPr>
+          <w:p>
+            <w:r>
+              <w:rPr>
+                <w:sz w:val="18"/>
+              </w:rPr>
+              <w:t>9 casos del servidor y 6 del panel correctos</w:t>
+            </w:r>
+          </w:p>
+        </w:tc>
+      </w:tr>
+      <w:tr>
+        <w:tc>
+          <w:tcPr>
+            <w:tcW w:type="dxa" w:w="4800"/>
+          </w:tcPr>
+          <w:p>
+            <w:r>
+              <w:rPr>
+                <w:sz w:val="18"/>
+              </w:rPr>
+              <w:t>Compilación Android</w:t>
+            </w:r>
+          </w:p>
+        </w:tc>
+        <w:tc>
+          <w:tcPr>
+            <w:tcW w:type="dxa" w:w="4800"/>
+          </w:tcPr>
+          <w:p>
+            <w:r>
+              <w:rPr>
+                <w:sz w:val="18"/>
+              </w:rPr>
+              <w:t>APK actualizado generado; firma verificada</w:t>
             </w:r>
           </w:p>
         </w:tc>
@@ -1237,32 +2242,22 @@
         <w:pStyle w:val="Titre2"/>
       </w:pPr>
       <w:r>
-        <w:t>Problemas y soluciones</w:t>
-      </w:r>
-    </w:p>
-    <w:p>
-      <w:r>
-        <w:t>Expo Go no puede ejecutar nuestro servicio NFC. Por eso se añadió un módulo Kotlin y se compiló un APK propio. Cada cambio en ese módulo requiere volver a compilar e instalar la app.</w:t>
-      </w:r>
-    </w:p>
-    <w:p>
-      <w:r>
-        <w:t>El login necesitaba el formato exacto de la API. Se usó el ejemplo del profesor para enviar user, pass y token. Esto evita errores por campos incompletos. Las pruebas con respuestas simuladas verifican el manejo de errores, pero no comprueban la contraseña de cada cuenta.</w:t>
-      </w:r>
-    </w:p>
-    <w:p>
-      <w:r>
-        <w:t>El ID puede superar el límite de un Int de Kotlin. Se guarda como Long y después se divide en cuatro bytes. Si se cortara el número por error, el lector podría recibir el ID de otra persona.</w:t>
-      </w:r>
-    </w:p>
-    <w:p>
-      <w:r>
-        <w:t>La primera compilación se detuvo al descargar una dependencia. Se repitió con más tiempo de espera y terminó correctamente. Las fotos usan HTTPS y, si fallan, se muestran las iniciales. Así el nombre y el número siguen visibles.</w:t>
-      </w:r>
-    </w:p>
-    <w:p>
-      <w:r>
-        <w:t>Las pruebas realizadas cubren el software: pantallas, formato de la petición y compilación. Este reporte no incluye resultados de una lectura NFC en un teléfono real. Por eso no se afirma que el montaje haya permitido o negado el acceso. Esa comprobación requiere comparar la cuenta utilizada, el registro del panel y el LED, incluido el caso de la cuenta bloqueada.</w:t>
+        <w:t>Qué muestran las pruebas</w:t>
+      </w:r>
+    </w:p>
+    <w:p>
+      <w:r>
+        <w:t>Los tres perfiles se pueden consultar y sus fotos cargan. El servidor de acceso reconoció los tres IDs y respondió si. Esto verifica los registros y la autorización al consultar el servidor directamente. No demuestra que el teléfono haya enviado esos datos ni que las contraseñas sean correctas. No se tuvieron las contraseñas; para login solo se comprobó un rechazo real con una cuenta ficticia.</w:t>
+      </w:r>
+    </w:p>
+    <w:p>
+      <w:r>
+        <w:t>El error de orden de bytes podía cambiar el usuario recibido por el lector. Por ejemplo, los bytes iniciales del ID de Aristide se habrían interpretado como otro número. Después del cambio, los tres IDs se recuperaron sin alteración al leerlos como lo hace el firmware. Esta fue una corrección de compatibilidad, no de diseño visual.</w:t>
+      </w:r>
+    </w:p>
+    <w:p>
+      <w:r>
+        <w:t>Las consultas reales comprobaron la API y la recepción del panel. Las simulaciones comprobaron la interfaz y las respuestas del código. No se contó con un Android NFC para unir esas partes en una prueba física. Por eso no se afirma que el montaje haya permitido o negado un acceso real. El APK compilado permite comprobarlo cuando se disponga del teléfono y del PN532.</w:t>
       </w:r>
     </w:p>
     <w:p>
@@ -1275,7 +2270,7 @@
     </w:p>
     <w:p>
       <w:r>
-        <w:t>El ID enviado por NFC siempre es el mismo y podría copiarse. Para un uso real haría falta una prueba de identidad que cambie en cada lectura y proteger la conexión del Arduino con el servidor. En el panel sería útil buscar por usuario o fecha y distinguir una cuenta bloqueada de un fallo de red. También conviene ofrecer una tarjeta física a quien no pueda usar el teléfono.</w:t>
+        <w:t>El ID es fijo y aparece en el perfil público. Conocerlo no demuestra quién tiene el teléfono. Para un uso en empresa proponemos una respuesta distinta en cada lectura, comprobada por el servidor, y HTTPS entre el Arduino y el servidor. El panel podría filtrar por usuario y distinguir un bloqueo de un fallo de red. También hace falta una tarjeta de préstamo para quien no pueda usar el móvil.</w:t>
       </w:r>
     </w:p>
     <w:p>
@@ -1301,7 +2296,7 @@
     </w:p>
     <w:p>
       <w:r>
-        <w:t>A la empresa Voz · Estrategia le proponemos este sistema para controlar la entrada a su callcenter de estrategias políticas. Durante una campaña puede cambiar el personal y haber varios turnos. Con una cuenta por trabajador, la empresa puede retirar el acceso cuando termina un contrato sin esperar a que le devuelvan una tarjeta. El panel también ayuda a revisar un intento de entrada si surge un problema en recepción. Esto resulta útil en un lugar donde se manejan listas de contactos y guiones de llamadas. La app conserva una tarea sencilla: identificar al trabajador. El lector y el servidor toman la decisión de acceso. Para llevar el prototipo a una empresa, primero hay que reforzar la protección del ID y comprobar el funcionamiento del montaje con las cuentas reales.</w:t>
+        <w:t>A Voz · Estrategia le proponemos este sistema para organizar la entrada a su callcenter de estrategias políticas. En una campaña puede entrar personal temporal y cambiar la distribución de turnos. Una cuenta por trabajador permite retirar su acceso cuando acaba el contrato, sin esperar a recuperar una tarjeta. En recepción, el panel ayuda a comprobar qué cuenta se presentó cuando hay una incidencia. Es útil en un lugar donde se manejan listas de contactos y guiones de llamadas. Antes de comprar un despliegue completo, la empresa debería pedir una prueba con su lector, sus turnos y una cuenta bloqueada. También habría que proteger mejor el ID: identificar una cuenta con un número público no basta para proteger esos datos.</w:t>
       </w:r>
     </w:p>
     <w:p>
@@ -1315,6 +2310,17 @@
       </w:pPr>
       <w:r>
         <w:t>Bibliografía</w:t>
+      </w:r>
+    </w:p>
+    <w:p>
+      <w:pPr>
+        <w:spacing w:after="100"/>
+      </w:pPr>
+      <w:r>
+        <w:rPr>
+          <w:sz w:val="16"/>
+        </w:rPr>
+        <w:t>Espressif Systems. (s. f.). ESP32-S3 Technical Reference Manual, capítulo System and Memory. https://documentation.espressif.com/esp32-s3_technical_reference_manual_en.pdf</w:t>
       </w:r>
     </w:p>
     <w:p>

</xml_diff>

<commit_message>
Normalize API names and verify real logins for all GIGN members
</commit_message>
<xml_diff>
--- a/reporte/Reporte_Practica4_GIGN.docx
+++ b/reporte/Reporte_Practica4_GIGN.docx
@@ -805,7 +805,7 @@
     </w:p>
     <w:p>
       <w:r>
-        <w:t>Estas capturas se hicieron en el navegador. La API rechazó una cuenta ficticia que no existe. Después, se preparó una sesión con los datos públicos de Aristide para revisar la credencial. No se usó su contraseña.</w:t>
+        <w:t>Se inició sesión desde el navegador con las tres cuentas reales del equipo y la API del profesor. Estas capturas muestran el formulario de acceso y la credencial de Aristide después de una conexión correcta. Los resultados y las imágenes no incluyen contraseñas.</w:t>
       </w:r>
     </w:p>
     <w:tbl>
@@ -835,7 +835,7 @@
                     <a:graphicData uri="http://schemas.openxmlformats.org/drawingml/2006/picture">
                       <pic:pic>
                         <pic:nvPicPr>
-                          <pic:cNvPr id="0" name="login.png"/>
+                          <pic:cNvPr id="0" name="login-real-form.png"/>
                           <pic:cNvPicPr/>
                         </pic:nvPicPr>
                         <pic:blipFill>
@@ -876,7 +876,7 @@
                     <a:graphicData uri="http://schemas.openxmlformats.org/drawingml/2006/picture">
                       <pic:pic>
                         <pic:nvPicPr>
-                          <pic:cNvPr id="0" name="credential-full.png"/>
+                          <pic:cNvPr id="0" name="credential-real-full.png"/>
                           <pic:cNvPicPr/>
                         </pic:nvPicPr>
                         <pic:blipFill>
@@ -904,7 +904,7 @@
     </w:tbl>
     <w:p>
       <w:r>
-        <w:t>Figuras 3 y 4. Formulario tras un rechazo real de la API y credencial preparada con una respuesta simulada de login.</w:t>
+        <w:t>Figuras 3 y 4. Formulario de acceso y credencial de Aristide tras un login real con la API.</w:t>
       </w:r>
     </w:p>
     <w:p>
@@ -1085,7 +1085,7 @@
     </w:p>
     <w:p>
       <w:r>
-        <w:t>Con esos datos se prepararon tres respuestas de login en el navegador. Para cada usuario se revisaron el nombre, el número, la carga de la foto y el cierre de sesión. Esta prueba comprueba las pantallas; no comprueba la contraseña ni el permiso de entrada de la cuenta.</w:t>
+        <w:t>La API aceptó los datos de acceso de Aristide, Mathis y Oscar: tres respuestas HTTP 200 con el ID esperado. Para cada cuenta se comprobaron el nombre completo, el número, la foto y el cierre de sesión. Después de salir, abrir la ruta de la credencial devolvió al formulario de acceso.</w:t>
       </w:r>
     </w:p>
     <w:tbl>
@@ -1116,7 +1116,7 @@
                     <a:graphicData uri="http://schemas.openxmlformats.org/drawingml/2006/picture">
                       <pic:pic>
                         <pic:nvPicPr>
-                          <pic:cNvPr id="0" name="credential-aristidecordonnier.png"/>
+                          <pic:cNvPr id="0" name="credential-real-aristidecordonnier.png"/>
                           <pic:cNvPicPr/>
                         </pic:nvPicPr>
                         <pic:blipFill>
@@ -1157,7 +1157,7 @@
                     <a:graphicData uri="http://schemas.openxmlformats.org/drawingml/2006/picture">
                       <pic:pic>
                         <pic:nvPicPr>
-                          <pic:cNvPr id="0" name="credential-mathisgil.png"/>
+                          <pic:cNvPr id="0" name="credential-real-mathisgil.png"/>
                           <pic:cNvPicPr/>
                         </pic:nvPicPr>
                         <pic:blipFill>
@@ -1198,7 +1198,7 @@
                     <a:graphicData uri="http://schemas.openxmlformats.org/drawingml/2006/picture">
                       <pic:pic>
                         <pic:nvPicPr>
-                          <pic:cNvPr id="0" name="credential-oscarbuat.png"/>
+                          <pic:cNvPr id="0" name="credential-real-oscarbuat.png"/>
                           <pic:cNvPicPr/>
                         </pic:nvPicPr>
                         <pic:blipFill>
@@ -1230,12 +1230,12 @@
           <w:i/>
           <w:sz w:val="18"/>
         </w:rPr>
-        <w:t>Figura 6. Las tres credenciales en la app con respuestas de login simuladas y fotos reales del perfil.</w:t>
-      </w:r>
-    </w:p>
-    <w:p>
-      <w:r>
-        <w:t>No hubo que cambiar otra vez las fotos. Las URLs de las tres imágenes siguen siendo las guardadas en el trabajo anterior. Consultar un perfil público confirma que existe y que su imagen carga; iniciar sesión requiere además la contraseña.</w:t>
+        <w:t>Figura 6. Las tres credenciales obtenidas con conexiones reales a MonsterBallGo desde la app en el navegador.</w:t>
+      </w:r>
+    </w:p>
+    <w:p>
+      <w:r>
+        <w:t>No hubo que cambiar otra vez las fotos. Las URLs de las tres imágenes siguen siendo las guardadas en el trabajo anterior. También se comprobó que la petición enviaba la contraseña convertida con SHA-256 y que ni la contraseña ni ese valor quedaban en localStorage o sessionStorage. Al salir, el campo de contraseña quedó vacío.</w:t>
       </w:r>
     </w:p>
     <w:p>
@@ -2078,7 +2078,7 @@
               <w:rPr>
                 <w:sz w:val="18"/>
               </w:rPr>
-              <w:t>Login con cuenta ficticia inexistente</w:t>
+              <w:t>Login real con las tres cuentas</w:t>
             </w:r>
           </w:p>
         </w:tc>
@@ -2091,7 +2091,7 @@
               <w:rPr>
                 <w:sz w:val="18"/>
               </w:rPr>
-              <w:t>API real devuelve Failed to login; la app muestra el error</w:t>
+              <w:t>HTTP 200; foto, nombre e ID correctos; cierre de sesión y ruta protegida correctos</w:t>
             </w:r>
           </w:p>
         </w:tc>
@@ -2106,7 +2106,7 @@
               <w:rPr>
                 <w:sz w:val="18"/>
               </w:rPr>
-              <w:t>API del escáner y panel reales</w:t>
+              <w:t>Cuenta ficticia inexistente</w:t>
             </w:r>
           </w:p>
         </w:tc>
@@ -2119,7 +2119,7 @@
               <w:rPr>
                 <w:sz w:val="18"/>
               </w:rPr>
-              <w:t>Los tres IDs reciben si; sus nombres e IDs aparecen en verde en el panel</w:t>
+              <w:t>API real devuelve Failed to login; la app muestra el error</w:t>
             </w:r>
           </w:p>
         </w:tc>
@@ -2134,7 +2134,7 @@
               <w:rPr>
                 <w:sz w:val="18"/>
               </w:rPr>
-              <w:t>Interfaz en navegador</w:t>
+              <w:t>API del escáner y panel reales</w:t>
             </w:r>
           </w:p>
         </w:tc>
@@ -2147,7 +2147,7 @@
               <w:rPr>
                 <w:sz w:val="18"/>
               </w:rPr>
-              <w:t>20 comprobaciones correctas, incluidas las tres credenciales preparadas y la desconexión</w:t>
+              <w:t>Los tres IDs reciben si; sus nombres e IDs aparecen en verde en el panel</w:t>
             </w:r>
           </w:p>
         </w:tc>
@@ -2162,7 +2162,7 @@
               <w:rPr>
                 <w:sz w:val="18"/>
               </w:rPr>
-              <w:t>Servicio APDU en computadora</w:t>
+              <w:t>Interfaz y errores simulados</w:t>
             </w:r>
           </w:p>
         </w:tc>
@@ -2175,7 +2175,7 @@
               <w:rPr>
                 <w:sz w:val="18"/>
               </w:rPr>
-              <w:t>20 comprobaciones correctas con funciones Android sustituidas</w:t>
+              <w:t>20 comprobaciones correctas con el formato de nombres de la API real</w:t>
             </w:r>
           </w:p>
         </w:tc>
@@ -2190,7 +2190,7 @@
               <w:rPr>
                 <w:sz w:val="18"/>
               </w:rPr>
-              <w:t>Servidor y panel con datos simulados</w:t>
+              <w:t>Servicio APDU en computadora</w:t>
             </w:r>
           </w:p>
         </w:tc>
@@ -2203,7 +2203,7 @@
               <w:rPr>
                 <w:sz w:val="18"/>
               </w:rPr>
-              <w:t>9 casos del servidor y 6 del panel correctos</w:t>
+              <w:t>20 comprobaciones correctas con funciones Android sustituidas</w:t>
             </w:r>
           </w:p>
         </w:tc>
@@ -2218,6 +2218,34 @@
               <w:rPr>
                 <w:sz w:val="18"/>
               </w:rPr>
+              <w:t>Servidor y panel con datos simulados</w:t>
+            </w:r>
+          </w:p>
+        </w:tc>
+        <w:tc>
+          <w:tcPr>
+            <w:tcW w:type="dxa" w:w="4800"/>
+          </w:tcPr>
+          <w:p>
+            <w:r>
+              <w:rPr>
+                <w:sz w:val="18"/>
+              </w:rPr>
+              <w:t>9 casos del servidor y 6 del panel correctos</w:t>
+            </w:r>
+          </w:p>
+        </w:tc>
+      </w:tr>
+      <w:tr>
+        <w:tc>
+          <w:tcPr>
+            <w:tcW w:type="dxa" w:w="4800"/>
+          </w:tcPr>
+          <w:p>
+            <w:r>
+              <w:rPr>
+                <w:sz w:val="18"/>
+              </w:rPr>
               <w:t>Compilación Android</w:t>
             </w:r>
           </w:p>
@@ -2247,7 +2275,7 @@
     </w:p>
     <w:p>
       <w:r>
-        <w:t>Los tres perfiles se pueden consultar y sus fotos cargan. El servidor de acceso reconoció los tres IDs y respondió si. Esto verifica los registros y la autorización al consultar el servidor directamente. No demuestra que el teléfono haya enviado esos datos ni que las contraseñas sean correctas. No se tuvieron las contraseñas; para login solo se comprobó un rechazo real con una cuenta ficticia.</w:t>
+        <w:t>El login real funcionó con las tres cuentas. La primera conexión mostró una diferencia que las respuestas simuladas no habían revelado: la API usa firstname y lastname. La pantalla esperaba first_name y last_name y mostraba el usuario en lugar del nombre completo. Se adaptó src/api.js y se repitieron las conexiones. Las tres credenciales mostraron los datos correctos y el cierre de sesión protegió su pantalla.</w:t>
       </w:r>
     </w:p>
     <w:p>
@@ -2257,7 +2285,7 @@
     </w:p>
     <w:p>
       <w:r>
-        <w:t>Las consultas reales comprobaron la API y la recepción del panel. Las simulaciones comprobaron la interfaz y las respuestas del código. No se contó con un Android NFC para unir esas partes en una prueba física. Por eso no se afirma que el montaje haya permitido o negado un acceso real. El APK compilado permite comprobarlo cuando se disponga del teléfono y del PN532.</w:t>
+        <w:t>Se comprobó el recorrido formulario, API, credencial y cierre de sesión en el navegador, además de las consultas reales al servidor del escáner y la recepción del panel. Falta repetir el recorrido con el APK en Android y entregar el ID por NFC al PN532. No se contó con ese teléfono: la comunicación por radio, la vibración y los LED del montaje no se han verificado.</w:t>
       </w:r>
     </w:p>
     <w:p>

</xml_diff>

<commit_message>
Leave NFC demonstration results and evidence fields blank
</commit_message>
<xml_diff>
--- a/reporte/Reporte_Practica4_GIGN.docx
+++ b/reporte/Reporte_Practica4_GIGN.docx
@@ -1455,7 +1455,7 @@
         <w:pStyle w:val="Titre2"/>
       </w:pPr>
       <w:r>
-        <w:t>Ejecución sin teléfono</w:t>
+        <w:t>Verificación del código APDU</w:t>
       </w:r>
     </w:p>
     <w:p>
@@ -1616,7 +1616,7 @@
     </w:tbl>
     <w:p>
       <w:r>
-        <w:t>Estos resultados verifican el cálculo y las respuestas del código. No miden la comunicación por radio, la vibración física ni el funcionamiento de HCE en un teléfono. La app sigue sin llamar al endpoint del escáner y sin mostrar una decisión de acceso.</w:t>
+        <w:t>Las 20 comprobaciones verificaron el cálculo del ID y las respuestas de la clase Kotlin. La app no llama al endpoint del escáner ni muestra una decisión de acceso.</w:t>
       </w:r>
     </w:p>
     <w:p>
@@ -1627,11 +1627,176 @@
         <w:t>Prueba con el montaje</w:t>
       </w:r>
     </w:p>
-    <w:p>
-      <w:r>
-        <w:t>Instalar el APK, activar NFC e iniciar sesión. Acercar el teléfono desbloqueado al PN532, revisar la detección en la app y comparar el ID del panel con la credencial. Repetir con cada integrante, incluido el que bloquee el profesor, y fotografiar el LED del mismo intento.</w:t>
-      </w:r>
-    </w:p>
+    <w:tbl>
+      <w:tblPr>
+        <w:tblStyle w:val="Grilledutableau"/>
+        <w:tblW w:type="auto" w:w="0"/>
+        <w:tblLook w:firstColumn="1" w:firstRow="1" w:lastColumn="0" w:lastRow="0" w:noHBand="0" w:noVBand="1" w:val="04A0"/>
+      </w:tblPr>
+      <w:tblGrid>
+        <w:gridCol w:w="3200"/>
+        <w:gridCol w:w="3200"/>
+        <w:gridCol w:w="3200"/>
+      </w:tblGrid>
+      <w:tr>
+        <w:tc>
+          <w:tcPr>
+            <w:tcW w:type="dxa" w:w="3200"/>
+          </w:tcPr>
+          <w:p>
+            <w:r>
+              <w:rPr>
+                <w:sz w:val="18"/>
+              </w:rPr>
+              <w:t>Usuario</w:t>
+            </w:r>
+          </w:p>
+        </w:tc>
+        <w:tc>
+          <w:tcPr>
+            <w:tcW w:type="dxa" w:w="3200"/>
+          </w:tcPr>
+          <w:p>
+            <w:r>
+              <w:rPr>
+                <w:sz w:val="18"/>
+              </w:rPr>
+              <w:t>Resultado en el panel</w:t>
+            </w:r>
+          </w:p>
+        </w:tc>
+        <w:tc>
+          <w:tcPr>
+            <w:tcW w:type="dxa" w:w="3200"/>
+          </w:tcPr>
+          <w:p>
+            <w:r>
+              <w:rPr>
+                <w:sz w:val="18"/>
+              </w:rPr>
+              <w:t>LED</w:t>
+            </w:r>
+          </w:p>
+        </w:tc>
+      </w:tr>
+      <w:tr>
+        <w:tc>
+          <w:tcPr>
+            <w:tcW w:type="dxa" w:w="3200"/>
+          </w:tcPr>
+          <w:p>
+            <w:r>
+              <w:rPr>
+                <w:sz w:val="18"/>
+              </w:rPr>
+              <w:t>aristidecordonnier</w:t>
+            </w:r>
+          </w:p>
+        </w:tc>
+        <w:tc>
+          <w:tcPr>
+            <w:tcW w:type="dxa" w:w="3200"/>
+          </w:tcPr>
+          <w:p>
+            <w:r>
+              <w:rPr>
+                <w:sz w:val="18"/>
+              </w:rPr>
+            </w:r>
+          </w:p>
+        </w:tc>
+        <w:tc>
+          <w:tcPr>
+            <w:tcW w:type="dxa" w:w="3200"/>
+          </w:tcPr>
+          <w:p>
+            <w:r>
+              <w:rPr>
+                <w:sz w:val="18"/>
+              </w:rPr>
+            </w:r>
+          </w:p>
+        </w:tc>
+      </w:tr>
+      <w:tr>
+        <w:tc>
+          <w:tcPr>
+            <w:tcW w:type="dxa" w:w="3200"/>
+          </w:tcPr>
+          <w:p>
+            <w:r>
+              <w:rPr>
+                <w:sz w:val="18"/>
+              </w:rPr>
+              <w:t>mathisgil</w:t>
+            </w:r>
+          </w:p>
+        </w:tc>
+        <w:tc>
+          <w:tcPr>
+            <w:tcW w:type="dxa" w:w="3200"/>
+          </w:tcPr>
+          <w:p>
+            <w:r>
+              <w:rPr>
+                <w:sz w:val="18"/>
+              </w:rPr>
+            </w:r>
+          </w:p>
+        </w:tc>
+        <w:tc>
+          <w:tcPr>
+            <w:tcW w:type="dxa" w:w="3200"/>
+          </w:tcPr>
+          <w:p>
+            <w:r>
+              <w:rPr>
+                <w:sz w:val="18"/>
+              </w:rPr>
+            </w:r>
+          </w:p>
+        </w:tc>
+      </w:tr>
+      <w:tr>
+        <w:tc>
+          <w:tcPr>
+            <w:tcW w:type="dxa" w:w="3200"/>
+          </w:tcPr>
+          <w:p>
+            <w:r>
+              <w:rPr>
+                <w:sz w:val="18"/>
+              </w:rPr>
+              <w:t>oscarbuat</w:t>
+            </w:r>
+          </w:p>
+        </w:tc>
+        <w:tc>
+          <w:tcPr>
+            <w:tcW w:type="dxa" w:w="3200"/>
+          </w:tcPr>
+          <w:p>
+            <w:r>
+              <w:rPr>
+                <w:sz w:val="18"/>
+              </w:rPr>
+            </w:r>
+          </w:p>
+        </w:tc>
+        <w:tc>
+          <w:tcPr>
+            <w:tcW w:type="dxa" w:w="3200"/>
+          </w:tcPr>
+          <w:p>
+            <w:r>
+              <w:rPr>
+                <w:sz w:val="18"/>
+              </w:rPr>
+            </w:r>
+          </w:p>
+        </w:tc>
+      </w:tr>
+    </w:tbl>
     <w:p>
       <w:r>
         <w:br w:type="page"/>
@@ -1647,7 +1812,7 @@
     </w:p>
     <w:p>
       <w:r>
-        <w:t>Desde la computadora se consultó el endpoint HTTPS del escáner con los tres IDs del equipo. Cada consulta respondió HTTP 200 y si. El panel real recibió los datos por WebSocket, mostró el nombre y el número correctos y pintó la tarjeta en verde. No se usó NFC para producir estos eventos ni se cambió el estado de las cuentas.</w:t>
+        <w:t>Desde la computadora se consultó el endpoint HTTPS del escáner con los tres IDs del equipo. Cada consulta respondió HTTP 200 y si. El panel real recibió los datos por WebSocket, mostró el nombre y el número correctos y pintó la tarjeta en verde.</w:t>
       </w:r>
     </w:p>
     <w:tbl>
@@ -1968,7 +2133,7 @@
           <w:i/>
           <w:sz w:val="18"/>
         </w:rPr>
-        <w:t>Figura 7. Panel real del profesor después de consultas directas a la API desde la computadora. No son escaneos NFC. Se recortaron los datos de contacto.</w:t>
+        <w:t>Figura 7. Panel real del profesor después de consultas directas a la API desde la computadora. Se recortaron los datos de contacto.</w:t>
       </w:r>
     </w:p>
     <w:p>
@@ -1985,21 +2150,11 @@
       </w:r>
     </w:p>
     <w:p>
-      <w:r>
-        <w:t>Estas pruebas muestran que la base real reconoce los tres IDs y que el panel recibe los eventos. Para la demostración exigida falta que el teléfono entregue el ID por NFC y que el Arduino encienda el LED correspondiente. El profesor debe bloquear una cuenta para comprobar también ese rechazo en el montaje real.</w:t>
-      </w:r>
-    </w:p>
-    <w:p>
-      <w:r>
-        <w:br w:type="page"/>
-      </w:r>
-    </w:p>
-    <w:p>
-      <w:pPr>
-        <w:pStyle w:val="Titre1"/>
-      </w:pPr>
-      <w:r>
-        <w:t>Análisis de resultados y mejoras</w:t>
+      <w:pPr>
+        <w:pStyle w:val="Titre2"/>
+      </w:pPr>
+      <w:r>
+        <w:t>Evidencia del montaje</w:t>
       </w:r>
     </w:p>
     <w:tbl>
@@ -2019,10 +2174,7 @@
           </w:tcPr>
           <w:p>
             <w:r>
-              <w:rPr>
-                <w:sz w:val="18"/>
-              </w:rPr>
-              <w:t>Prueba</w:t>
+              <w:t>Panel web</w:t>
             </w:r>
           </w:p>
         </w:tc>
@@ -2032,38 +2184,76 @@
           </w:tcPr>
           <w:p>
             <w:r>
-              <w:rPr>
-                <w:sz w:val="18"/>
-              </w:rPr>
-              <w:t>Resultado observado</w:t>
+              <w:t>Arduino y LED</w:t>
             </w:r>
           </w:p>
         </w:tc>
       </w:tr>
       <w:tr>
+        <w:trPr>
+          <w:trHeight w:val="1440"/>
+        </w:trPr>
         <w:tc>
           <w:tcPr>
             <w:tcW w:type="dxa" w:w="4800"/>
           </w:tcPr>
-          <w:p>
-            <w:r>
-              <w:rPr>
-                <w:sz w:val="18"/>
-              </w:rPr>
-              <w:t>Perfiles e imágenes de los tres usuarios</w:t>
-            </w:r>
-          </w:p>
+          <w:p/>
         </w:tc>
         <w:tc>
           <w:tcPr>
             <w:tcW w:type="dxa" w:w="4800"/>
           </w:tcPr>
-          <w:p>
-            <w:r>
-              <w:rPr>
-                <w:sz w:val="18"/>
-              </w:rPr>
-              <w:t>Seis respuestas HTTP 200; datos e imágenes coinciden</w:t>
+          <w:p/>
+        </w:tc>
+      </w:tr>
+    </w:tbl>
+    <w:p>
+      <w:r>
+        <w:br w:type="page"/>
+      </w:r>
+    </w:p>
+    <w:p>
+      <w:pPr>
+        <w:pStyle w:val="Titre1"/>
+      </w:pPr>
+      <w:r>
+        <w:t>Análisis de resultados y mejoras</w:t>
+      </w:r>
+    </w:p>
+    <w:tbl>
+      <w:tblPr>
+        <w:tblStyle w:val="Grilledutableau"/>
+        <w:tblW w:type="auto" w:w="0"/>
+        <w:tblLook w:firstColumn="1" w:firstRow="1" w:lastColumn="0" w:lastRow="0" w:noHBand="0" w:noVBand="1" w:val="04A0"/>
+      </w:tblPr>
+      <w:tblGrid>
+        <w:gridCol w:w="4800"/>
+        <w:gridCol w:w="4800"/>
+      </w:tblGrid>
+      <w:tr>
+        <w:tc>
+          <w:tcPr>
+            <w:tcW w:type="dxa" w:w="4800"/>
+          </w:tcPr>
+          <w:p>
+            <w:r>
+              <w:rPr>
+                <w:sz w:val="18"/>
+              </w:rPr>
+              <w:t>Prueba</w:t>
+            </w:r>
+          </w:p>
+        </w:tc>
+        <w:tc>
+          <w:tcPr>
+            <w:tcW w:type="dxa" w:w="4800"/>
+          </w:tcPr>
+          <w:p>
+            <w:r>
+              <w:rPr>
+                <w:sz w:val="18"/>
+              </w:rPr>
+              <w:t>Resultado observado</w:t>
             </w:r>
           </w:p>
         </w:tc>
@@ -2078,7 +2268,7 @@
               <w:rPr>
                 <w:sz w:val="18"/>
               </w:rPr>
-              <w:t>Login real con las tres cuentas</w:t>
+              <w:t>Perfiles e imágenes de los tres usuarios</w:t>
             </w:r>
           </w:p>
         </w:tc>
@@ -2091,7 +2281,7 @@
               <w:rPr>
                 <w:sz w:val="18"/>
               </w:rPr>
-              <w:t>HTTP 200; foto, nombre e ID correctos; cierre de sesión y ruta protegida correctos</w:t>
+              <w:t>Seis respuestas HTTP 200; datos e imágenes coinciden</w:t>
             </w:r>
           </w:p>
         </w:tc>
@@ -2106,7 +2296,7 @@
               <w:rPr>
                 <w:sz w:val="18"/>
               </w:rPr>
-              <w:t>Cuenta ficticia inexistente</w:t>
+              <w:t>Login real con las tres cuentas</w:t>
             </w:r>
           </w:p>
         </w:tc>
@@ -2119,7 +2309,7 @@
               <w:rPr>
                 <w:sz w:val="18"/>
               </w:rPr>
-              <w:t>API real devuelve Failed to login; la app muestra el error</w:t>
+              <w:t>HTTP 200; foto, nombre e ID correctos; cierre de sesión y ruta protegida correctos</w:t>
             </w:r>
           </w:p>
         </w:tc>
@@ -2134,7 +2324,7 @@
               <w:rPr>
                 <w:sz w:val="18"/>
               </w:rPr>
-              <w:t>API del escáner y panel reales</w:t>
+              <w:t>Cuenta ficticia inexistente</w:t>
             </w:r>
           </w:p>
         </w:tc>
@@ -2147,7 +2337,7 @@
               <w:rPr>
                 <w:sz w:val="18"/>
               </w:rPr>
-              <w:t>Los tres IDs reciben si; sus nombres e IDs aparecen en verde en el panel</w:t>
+              <w:t>API real devuelve Failed to login; la app muestra el error</w:t>
             </w:r>
           </w:p>
         </w:tc>
@@ -2162,7 +2352,7 @@
               <w:rPr>
                 <w:sz w:val="18"/>
               </w:rPr>
-              <w:t>Interfaz y errores simulados</w:t>
+              <w:t>API del escáner y panel reales</w:t>
             </w:r>
           </w:p>
         </w:tc>
@@ -2175,7 +2365,7 @@
               <w:rPr>
                 <w:sz w:val="18"/>
               </w:rPr>
-              <w:t>20 comprobaciones correctas con el formato de nombres de la API real</w:t>
+              <w:t>Los tres IDs reciben si; sus nombres e IDs aparecen en verde en el panel</w:t>
             </w:r>
           </w:p>
         </w:tc>
@@ -2190,7 +2380,7 @@
               <w:rPr>
                 <w:sz w:val="18"/>
               </w:rPr>
-              <w:t>Servicio APDU en computadora</w:t>
+              <w:t>Interfaz y errores simulados</w:t>
             </w:r>
           </w:p>
         </w:tc>
@@ -2203,7 +2393,7 @@
               <w:rPr>
                 <w:sz w:val="18"/>
               </w:rPr>
-              <w:t>20 comprobaciones correctas con funciones Android sustituidas</w:t>
+              <w:t>20 comprobaciones correctas con el formato de nombres de la API real</w:t>
             </w:r>
           </w:p>
         </w:tc>
@@ -2218,7 +2408,7 @@
               <w:rPr>
                 <w:sz w:val="18"/>
               </w:rPr>
-              <w:t>Servidor y panel con datos simulados</w:t>
+              <w:t>Servicio APDU en computadora</w:t>
             </w:r>
           </w:p>
         </w:tc>
@@ -2231,7 +2421,7 @@
               <w:rPr>
                 <w:sz w:val="18"/>
               </w:rPr>
-              <w:t>9 casos del servidor y 6 del panel correctos</w:t>
+              <w:t>20 comprobaciones correctas con funciones Android sustituidas</w:t>
             </w:r>
           </w:p>
         </w:tc>
@@ -2246,6 +2436,34 @@
               <w:rPr>
                 <w:sz w:val="18"/>
               </w:rPr>
+              <w:t>Servidor y panel con datos simulados</w:t>
+            </w:r>
+          </w:p>
+        </w:tc>
+        <w:tc>
+          <w:tcPr>
+            <w:tcW w:type="dxa" w:w="4800"/>
+          </w:tcPr>
+          <w:p>
+            <w:r>
+              <w:rPr>
+                <w:sz w:val="18"/>
+              </w:rPr>
+              <w:t>9 casos del servidor y 6 del panel correctos</w:t>
+            </w:r>
+          </w:p>
+        </w:tc>
+      </w:tr>
+      <w:tr>
+        <w:tc>
+          <w:tcPr>
+            <w:tcW w:type="dxa" w:w="4800"/>
+          </w:tcPr>
+          <w:p>
+            <w:r>
+              <w:rPr>
+                <w:sz w:val="18"/>
+              </w:rPr>
               <w:t>Compilación Android</w:t>
             </w:r>
           </w:p>
@@ -2260,6 +2478,33 @@
                 <w:sz w:val="18"/>
               </w:rPr>
               <w:t>APK actualizado generado; firma verificada</w:t>
+            </w:r>
+          </w:p>
+        </w:tc>
+      </w:tr>
+      <w:tr>
+        <w:tc>
+          <w:tcPr>
+            <w:tcW w:type="dxa" w:w="4800"/>
+          </w:tcPr>
+          <w:p>
+            <w:r>
+              <w:rPr>
+                <w:sz w:val="18"/>
+              </w:rPr>
+              <w:t>Lectura NFC y resultado del montaje</w:t>
+            </w:r>
+          </w:p>
+        </w:tc>
+        <w:tc>
+          <w:tcPr>
+            <w:tcW w:type="dxa" w:w="4800"/>
+          </w:tcPr>
+          <w:p>
+            <w:r>
+              <w:rPr>
+                <w:sz w:val="18"/>
+              </w:rPr>
             </w:r>
           </w:p>
         </w:tc>
@@ -2285,7 +2530,7 @@
     </w:p>
     <w:p>
       <w:r>
-        <w:t>Se comprobó el recorrido formulario, API, credencial y cierre de sesión en el navegador, además de las consultas reales al servidor del escáner y la recepción del panel. Falta repetir el recorrido con el APK en Android y entregar el ID por NFC al PN532. No se contó con ese teléfono: la comunicación por radio, la vibración y los LED del montaje no se han verificado.</w:t>
+        <w:t>Se comprobó el recorrido formulario, API, credencial y cierre de sesión en el navegador, además de las consultas reales al servidor del escáner y la recepción del panel.</w:t>
       </w:r>
     </w:p>
     <w:p>
@@ -2324,7 +2569,7 @@
     </w:p>
     <w:p>
       <w:r>
-        <w:t>A Voz · Estrategia le proponemos este sistema para organizar la entrada a su callcenter de estrategias políticas. En una campaña puede entrar personal temporal y cambiar la distribución de turnos. Una cuenta por trabajador permite retirar su acceso cuando acaba el contrato, sin esperar a recuperar una tarjeta. En recepción, el panel ayuda a comprobar qué cuenta se presentó cuando hay una incidencia. Es útil en un lugar donde se manejan listas de contactos y guiones de llamadas. Antes de comprar un despliegue completo, la empresa debería pedir una prueba con su lector, sus turnos y una cuenta bloqueada. También habría que proteger mejor el ID: identificar una cuenta con un número público no basta para proteger esos datos.</w:t>
+        <w:t>A Voz · Estrategia le proponemos este sistema para organizar la entrada a su callcenter de estrategias políticas. En una campaña puede entrar personal temporal y cambiar la distribución de turnos. Una cuenta por trabajador permite retirar su acceso cuando acaba el contrato, sin esperar a recuperar una tarjeta. En recepción, el panel ayuda a comprobar qué cuenta se presentó cuando hay una incidencia. Es útil en un lugar donde se manejan listas de contactos y guiones de llamadas. La empresa debe definir quién puede bloquear una cuenta y quién puede consultar los accesos. También habría que proteger mejor el ID: identificar una cuenta con un número público no basta para proteger esos datos.</w:t>
       </w:r>
     </w:p>
     <w:p>

</xml_diff>